<commit_message>
feat: Add JSON template for event and meal menu structure.
</commit_message>
<xml_diff>
--- a/test_estimate.docx
+++ b/test_estimate.docx
@@ -1108,7 +1108,11 @@
           <w:p/>
           <w:p>
             <w:r>
-              <w:t>Breakfast: 8:00 AM to 10:00 AM</w:t>
+              <w:rPr>
+                <w:b/>
+                <w:color w:val="612D4B"/>
+              </w:rPr>
+              <w:t>Breakfast (8:00 AM to 10:00 AM)</w:t>
             </w:r>
           </w:p>
           <w:p>
@@ -1120,6 +1124,7 @@
             <w:r>
               <w:rPr>
                 <w:b/>
+                <w:color w:val="000000"/>
                 <w:u w:val="single"/>
               </w:rPr>
               <w:t>Pastries</w:t>
@@ -1131,8 +1136,15 @@
             </w:r>
           </w:p>
           <w:p>
-            <w:r>
-              <w:t>Croissants</w:t>
+            <w:pPr>
+              <w:ind w:left="283"/>
+            </w:pPr>
+            <w:r>
+              <w:rPr>
+                <w:b/>
+                <w:color w:val="612D4B"/>
+              </w:rPr>
+              <w:t>• Croissants</w:t>
               <w:br/>
               <w:t>Muffins</w:t>
               <w:br/>
@@ -1143,6 +1155,7 @@
             <w:r>
               <w:rPr>
                 <w:b/>
+                <w:color w:val="000000"/>
                 <w:u w:val="single"/>
               </w:rPr>
               <w:t>Beverages</w:t>
@@ -1154,8 +1167,15 @@
             </w:r>
           </w:p>
           <w:p>
-            <w:r>
-              <w:t>Coffee</w:t>
+            <w:pPr>
+              <w:ind w:left="283"/>
+            </w:pPr>
+            <w:r>
+              <w:rPr>
+                <w:b/>
+                <w:color w:val="612D4B"/>
+              </w:rPr>
+              <w:t>• Coffee</w:t>
               <w:br/>
               <w:t>Tea</w:t>
               <w:br/>

</xml_diff>